<commit_message>
feat: complete visual treatise audit, practical labs, and overnight study materials
</commit_message>
<xml_diff>
--- a/AIP-C01_Overnight_Study_Guide.docx
+++ b/AIP-C01_Overnight_Study_Guide.docx
@@ -20083,7 +20083,573 @@
         <w:rPr>
           <w:lang w:val="en"/>
         </w:rPr>
-        <w:t xml:space="preserve">Part 3: 30-Second Rapid Elimination Decision Matrix</w:t>
+        <w:t xml:space="preserve">Part 3: In-Scope Blueprint Gap Topics &amp; Advanced Primitives</w:t>
+      </w:r>
+    </w:p>
+    <w:p>
+      <w:pPr>
+        <w:pStyle w:val="BodyText"/>
+      </w:pPr>
+      <w:r>
+        <w:rPr>
+          <w:lang w:val="en"/>
+        </w:rPr>
+        <w:t xml:space="preserve">Amazon AppFlow &amp; AWS Transfer Family</w:t>
+      </w:r>
+      <w:r>
+        <w:rPr>
+          <w:lang w:val="en"/>
+        </w:rPr>
+        <w:t xml:space="preserve">Ingestion for Knowledge Bases</w:t>
+      </w:r>
+    </w:p>
+    <w:p>
+      <w:pPr>
+        <w:pStyle w:val="BodyText"/>
+      </w:pPr>
+      <w:r>
+        <w:rPr>
+          <w:lang w:val="en"/>
+        </w:rPr>
+        <w:t xml:space="preserve">AppFlow automates SaaS data ingestion (Salesforce, ServiceNow, Zendesk, Slack) directly into S3 for Knowledge Base syncing without custom ETL. AWS Transfer Family provides managed SFTP/FTPS/FTP endpoints dropping enterprise partner files directly into S3.</w:t>
+      </w:r>
+    </w:p>
+    <w:p>
+      <w:pPr>
+        <w:pStyle w:val="BodyText"/>
+      </w:pPr>
+      <w:r>
+        <w:rPr>
+          <w:lang w:val="en"/>
+        </w:rPr>
+        <w:t xml:space="preserve">Neptune Analytics &amp; GraphRAG</w:t>
+      </w:r>
+      <w:r>
+        <w:rPr>
+          <w:lang w:val="en"/>
+        </w:rPr>
+        <w:t xml:space="preserve">Knowledge Graph + Vector RAG</w:t>
+      </w:r>
+    </w:p>
+    <w:p>
+      <w:pPr>
+        <w:pStyle w:val="BodyText"/>
+      </w:pPr>
+      <w:r>
+        <w:rPr>
+          <w:lang w:val="en"/>
+        </w:rPr>
+        <w:t xml:space="preserve">Neptune Analytics executes in-memory graph algorithms and vector search together. When queries require tracing complex relationships (e.g. supply chain dependencies, fraud rings, organizational hierarchies), GraphRAG with Neptune outperforms pure similarity search.</w:t>
+      </w:r>
+    </w:p>
+    <w:p>
+      <w:pPr>
+        <w:pStyle w:val="BodyText"/>
+      </w:pPr>
+      <w:r>
+        <w:rPr>
+          <w:lang w:val="en"/>
+        </w:rPr>
+        <w:t xml:space="preserve">Amazon Q Apps &amp; Q Business</w:t>
+      </w:r>
+      <w:r>
+        <w:rPr>
+          <w:lang w:val="en"/>
+        </w:rPr>
+        <w:t xml:space="preserve">Generative AI Business Solutions</w:t>
+      </w:r>
+    </w:p>
+    <w:p>
+      <w:pPr>
+        <w:pStyle w:val="BodyText"/>
+      </w:pPr>
+      <w:r>
+        <w:rPr>
+          <w:lang w:val="en"/>
+        </w:rPr>
+        <w:t xml:space="preserve">Amazon Q Business connects to 40+ enterprise connectors with built-in ACL identity propagation. Amazon Q Apps allows non-technical employees to generate lightweight, custom multi-step AI business apps from a single natural language prompt.</w:t>
+      </w:r>
+    </w:p>
+    <w:p>
+      <w:pPr>
+        <w:pStyle w:val="BodyText"/>
+      </w:pPr>
+      <w:r>
+        <w:rPr>
+          <w:lang w:val="en"/>
+        </w:rPr>
+        <w:t xml:space="preserve">AWS WAF &amp; Amazon CloudFront Edge</w:t>
+      </w:r>
+      <w:r>
+        <w:rPr>
+          <w:lang w:val="en"/>
+        </w:rPr>
+        <w:t xml:space="preserve">DDoS &amp; Edge Prompt Validation</w:t>
+      </w:r>
+    </w:p>
+    <w:p>
+      <w:pPr>
+        <w:pStyle w:val="BodyText"/>
+      </w:pPr>
+      <w:r>
+        <w:rPr>
+          <w:lang w:val="en"/>
+        </w:rPr>
+        <w:t xml:space="preserve">CloudFront distributes GenAI web apps globally with low latency. AWS WAF protects API Gateway endpoints against DDoS, enforces IP rate-limiting, and blocks SQLi/XSS attacks before requests reach Bedrock. CloudFront Functions / Lambda@Edge inspects requests at the edge.</w:t>
+      </w:r>
+    </w:p>
+    <w:p>
+      <w:pPr>
+        <w:pStyle w:val="BodyText"/>
+      </w:pPr>
+      <w:r>
+        <w:rPr>
+          <w:lang w:val="en"/>
+        </w:rPr>
+        <w:t xml:space="preserve">The CountTokens API &amp; Token Calculation</w:t>
+      </w:r>
+      <w:r>
+        <w:rPr>
+          <w:lang w:val="en"/>
+        </w:rPr>
+        <w:t xml:space="preserve">Preventing Context Overflow</w:t>
+      </w:r>
+    </w:p>
+    <w:p>
+      <w:pPr>
+        <w:pStyle w:val="BodyText"/>
+      </w:pPr>
+      <w:r>
+        <w:rPr>
+          <w:lang w:val="en"/>
+        </w:rPr>
+        <w:t xml:space="preserve">The Bedrock</w:t>
+      </w:r>
+      <w:r>
+        <w:rPr>
+          <w:lang w:val="en"/>
+        </w:rPr>
+        <w:t xml:space="preserve"> </w:t>
+      </w:r>
+      <w:r>
+        <w:rPr>
+          <w:rStyle w:val="VerbatimChar"/>
+          <w:lang w:val="en"/>
+        </w:rPr>
+        <w:t xml:space="preserve">CountTokens</w:t>
+      </w:r>
+      <w:r>
+        <w:rPr>
+          <w:lang w:val="en"/>
+        </w:rPr>
+        <w:t xml:space="preserve"> </w:t>
+      </w:r>
+      <w:r>
+        <w:rPr>
+          <w:lang w:val="en"/>
+        </w:rPr>
+        <w:t xml:space="preserve">API calculates exact token counts for prompt text against specific model tokenizers before invocation, preventing runtime</w:t>
+      </w:r>
+      <w:r>
+        <w:rPr>
+          <w:lang w:val="en"/>
+        </w:rPr>
+        <w:t xml:space="preserve"> </w:t>
+      </w:r>
+      <w:r>
+        <w:rPr>
+          <w:rStyle w:val="VerbatimChar"/>
+          <w:lang w:val="en"/>
+        </w:rPr>
+        <w:t xml:space="preserve">ValidationException</w:t>
+      </w:r>
+      <w:r>
+        <w:rPr>
+          <w:lang w:val="en"/>
+        </w:rPr>
+        <w:t xml:space="preserve">. Crucial for dynamic sliding window memory calculation.</w:t>
+      </w:r>
+    </w:p>
+    <w:p>
+      <w:pPr>
+        <w:pStyle w:val="BodyText"/>
+      </w:pPr>
+      <w:r>
+        <w:rPr>
+          <w:lang w:val="en"/>
+        </w:rPr>
+        <w:t xml:space="preserve">top_k in the Converse API</w:t>
+      </w:r>
+      <w:r>
+        <w:rPr>
+          <w:lang w:val="en"/>
+        </w:rPr>
+        <w:t xml:space="preserve">Sampling via additionalModelRequestFields</w:t>
+      </w:r>
+    </w:p>
+    <w:p>
+      <w:pPr>
+        <w:pStyle w:val="BodyText"/>
+      </w:pPr>
+      <w:r>
+        <w:rPr>
+          <w:lang w:val="en"/>
+        </w:rPr>
+        <w:t xml:space="preserve">Converse API exposes temperature, topP, and maxTokens directly in inferenceConfig. To pass model-specific parameters like</w:t>
+      </w:r>
+      <w:r>
+        <w:rPr>
+          <w:lang w:val="en"/>
+        </w:rPr>
+        <w:t xml:space="preserve"> </w:t>
+      </w:r>
+      <w:r>
+        <w:rPr>
+          <w:rStyle w:val="VerbatimChar"/>
+          <w:lang w:val="en"/>
+        </w:rPr>
+        <w:t xml:space="preserve">top_k</w:t>
+      </w:r>
+      <w:r>
+        <w:rPr>
+          <w:lang w:val="en"/>
+        </w:rPr>
+        <w:t xml:space="preserve"> </w:t>
+      </w:r>
+      <w:r>
+        <w:rPr>
+          <w:lang w:val="en"/>
+        </w:rPr>
+        <w:t xml:space="preserve">(Anthropic) or</w:t>
+      </w:r>
+      <w:r>
+        <w:rPr>
+          <w:lang w:val="en"/>
+        </w:rPr>
+        <w:t xml:space="preserve"> </w:t>
+      </w:r>
+      <w:r>
+        <w:rPr>
+          <w:rStyle w:val="VerbatimChar"/>
+          <w:lang w:val="en"/>
+        </w:rPr>
+        <w:t xml:space="preserve">repetition_penalty</w:t>
+      </w:r>
+      <w:r>
+        <w:rPr>
+          <w:lang w:val="en"/>
+        </w:rPr>
+        <w:t xml:space="preserve">, use</w:t>
+      </w:r>
+      <w:r>
+        <w:rPr>
+          <w:lang w:val="en"/>
+        </w:rPr>
+        <w:t xml:space="preserve"> </w:t>
+      </w:r>
+      <w:r>
+        <w:rPr>
+          <w:rStyle w:val="VerbatimChar"/>
+          <w:lang w:val="en"/>
+        </w:rPr>
+        <w:t xml:space="preserve">additionalModelRequestFields={'top_k': 50}</w:t>
+      </w:r>
+      <w:r>
+        <w:rPr>
+          <w:lang w:val="en"/>
+        </w:rPr>
+        <w:t xml:space="preserve">.</w:t>
+      </w:r>
+    </w:p>
+    <w:p>
+      <w:pPr>
+        <w:pStyle w:val="BodyText"/>
+      </w:pPr>
+      <w:r>
+        <w:rPr>
+          <w:lang w:val="en"/>
+        </w:rPr>
+        <w:t xml:space="preserve">Amazon CloudWatch Evidently</w:t>
+      </w:r>
+      <w:r>
+        <w:rPr>
+          <w:lang w:val="en"/>
+        </w:rPr>
+        <w:t xml:space="preserve">A/B Testing &amp; Feature Flags</w:t>
+      </w:r>
+    </w:p>
+    <w:p>
+      <w:pPr>
+        <w:pStyle w:val="BodyText"/>
+      </w:pPr>
+      <w:r>
+        <w:rPr>
+          <w:lang w:val="en"/>
+        </w:rPr>
+        <w:t xml:space="preserve">CloudWatch Evidently manages feature flags, dark launches, and client-side variation experiments for foundation models. Allows comparing conversion and click-through metrics between Model A and Model B in production.</w:t>
+      </w:r>
+    </w:p>
+    <w:p>
+      <w:pPr>
+        <w:pStyle w:val="BodyText"/>
+      </w:pPr>
+      <w:r>
+        <w:rPr>
+          <w:lang w:val="en"/>
+        </w:rPr>
+        <w:t xml:space="preserve">Amazon Textract Tables &amp; Forms</w:t>
+      </w:r>
+      <w:r>
+        <w:rPr>
+          <w:lang w:val="en"/>
+        </w:rPr>
+        <w:t xml:space="preserve">Document Modality Extraction</w:t>
+      </w:r>
+    </w:p>
+    <w:p>
+      <w:pPr>
+        <w:pStyle w:val="BodyText"/>
+      </w:pPr>
+      <w:r>
+        <w:rPr>
+          <w:lang w:val="en"/>
+        </w:rPr>
+        <w:t xml:space="preserve">Standard OCR destroys two-dimensional tabular alignment into flat unreadable text. Textract</w:t>
+      </w:r>
+      <w:r>
+        <w:rPr>
+          <w:lang w:val="en"/>
+        </w:rPr>
+        <w:t xml:space="preserve"> </w:t>
+      </w:r>
+      <w:r>
+        <w:rPr>
+          <w:rStyle w:val="VerbatimChar"/>
+          <w:lang w:val="en"/>
+        </w:rPr>
+        <w:t xml:space="preserve">AnalyzeDocument(FeatureTypes=['TABLES', 'FORMS'])</w:t>
+      </w:r>
+      <w:r>
+        <w:rPr>
+          <w:lang w:val="en"/>
+        </w:rPr>
+        <w:t xml:space="preserve"> </w:t>
+      </w:r>
+      <w:r>
+        <w:rPr>
+          <w:lang w:val="en"/>
+        </w:rPr>
+        <w:t xml:space="preserve">preserves row-column relationships and key-value pairs for RAG ingestion.</w:t>
+      </w:r>
+    </w:p>
+    <w:p>
+      <w:pPr>
+        <w:pStyle w:val="BodyText"/>
+      </w:pPr>
+      <w:r>
+        <w:rPr>
+          <w:lang w:val="en"/>
+        </w:rPr>
+        <w:t xml:space="preserve">Binary Vectors &amp; Vector Quantization</w:t>
+      </w:r>
+      <w:r>
+        <w:rPr>
+          <w:lang w:val="en"/>
+        </w:rPr>
+        <w:t xml:space="preserve">Optimizing OpenSearch Serverless</w:t>
+      </w:r>
+    </w:p>
+    <w:p>
+      <w:pPr>
+        <w:pStyle w:val="BodyText"/>
+      </w:pPr>
+      <w:r>
+        <w:rPr>
+          <w:lang w:val="en"/>
+        </w:rPr>
+        <w:t xml:space="preserve">Binary vectors and FP16/INT8 scalar quantization in OpenSearch Serverless reduce vector memory footprint by up to 75% while maintaining &gt;95% retrieval accuracy, preventing OCU memory exhaustion on multi-million document collections.</w:t>
+      </w:r>
+    </w:p>
+    <w:p>
+      <w:pPr>
+        <w:pStyle w:val="BodyText"/>
+      </w:pPr>
+      <w:r>
+        <w:rPr>
+          <w:lang w:val="en"/>
+        </w:rPr>
+        <w:t xml:space="preserve">SageMaker Large-Model Distributed Tuning</w:t>
+      </w:r>
+      <w:r>
+        <w:rPr>
+          <w:lang w:val="en"/>
+        </w:rPr>
+        <w:t xml:space="preserve">FSDP &amp; DeepSpeed</w:t>
+      </w:r>
+    </w:p>
+    <w:p>
+      <w:pPr>
+        <w:pStyle w:val="BodyText"/>
+      </w:pPr>
+      <w:r>
+        <w:rPr>
+          <w:lang w:val="en"/>
+        </w:rPr>
+        <w:t xml:space="preserve">For models exceeding single-GPU VRAM (e.g. 70B+ parameters), use SageMaker PyTorch Fully Sharded Data Parallel (FSDP) or DeepSpeed ZeRO-3 across multi-node ml.p4d/ml.p5 GPU clusters to shard optimizer states, gradients, and model weights.</w:t>
+      </w:r>
+    </w:p>
+    <w:p>
+      <w:pPr>
+        <w:pStyle w:val="BodyText"/>
+      </w:pPr>
+      <w:r>
+        <w:rPr>
+          <w:lang w:val="en"/>
+        </w:rPr>
+        <w:t xml:space="preserve">Part 4: The 6 AWS AIP-C01 Question Patterns &amp; Elimination Tactics</w:t>
+      </w:r>
+    </w:p>
+    <w:p>
+      <w:pPr>
+        <w:pStyle w:val="BodyText"/>
+      </w:pPr>
+      <w:r>
+        <w:rPr>
+          <w:lang w:val="en"/>
+        </w:rPr>
+        <w:t xml:space="preserve">🎯 Pattern 1: Constraint Extraction</w:t>
+      </w:r>
+    </w:p>
+    <w:p>
+      <w:pPr>
+        <w:pStyle w:val="BodyText"/>
+      </w:pPr>
+      <w:r>
+        <w:rPr>
+          <w:lang w:val="en"/>
+        </w:rPr>
+        <w:t xml:space="preserve">Scenario stems present 3-4 constraints (residency, budget, latency, serverless). The credited option is the ONLY one that satisfies all constraints simultaneously. Read constraints first, options second.</w:t>
+      </w:r>
+    </w:p>
+    <w:p>
+      <w:pPr>
+        <w:pStyle w:val="BodyText"/>
+      </w:pPr>
+      <w:r>
+        <w:rPr>
+          <w:lang w:val="en"/>
+        </w:rPr>
+        <w:t xml:space="preserve">🎯 Pattern 2: MOST Correct, Not Merely Correct</w:t>
+      </w:r>
+    </w:p>
+    <w:p>
+      <w:pPr>
+        <w:pStyle w:val="BodyText"/>
+      </w:pPr>
+      <w:r>
+        <w:rPr>
+          <w:lang w:val="en"/>
+        </w:rPr>
+        <w:t xml:space="preserve">Multiple options will function architecturally, but the prompt asks for 'LEAST operational effort' or 'MOST cost-effective'. Bedrock managed services always beat self-hosted EC2/EKS on operational effort.</w:t>
+      </w:r>
+    </w:p>
+    <w:p>
+      <w:pPr>
+        <w:pStyle w:val="BodyText"/>
+      </w:pPr>
+      <w:r>
+        <w:rPr>
+          <w:lang w:val="en"/>
+        </w:rPr>
+        <w:t xml:space="preserve">🎯 Pattern 3: Lifecycle &amp; Ordering</w:t>
+      </w:r>
+    </w:p>
+    <w:p>
+      <w:pPr>
+        <w:pStyle w:val="BodyText"/>
+      </w:pPr>
+      <w:r>
+        <w:rPr>
+          <w:lang w:val="en"/>
+        </w:rPr>
+        <w:t xml:space="preserve">AWS quizes on the exact sequential order of operations. Example: Knowledge Base sync requires (1) S3 upload -&gt; (2) StartIngestionJob -&gt; (3) Status COMPLETE. Agent deployment requires (1) Edit -&gt; (2) PrepareAgent -&gt; (3) Create Alias.</w:t>
+      </w:r>
+    </w:p>
+    <w:p>
+      <w:pPr>
+        <w:pStyle w:val="BodyText"/>
+      </w:pPr>
+      <w:r>
+        <w:rPr>
+          <w:lang w:val="en"/>
+        </w:rPr>
+        <w:t xml:space="preserve">🎯 Pattern 4: Precision Vocabulary</w:t>
+      </w:r>
+    </w:p>
+    <w:p>
+      <w:pPr>
+        <w:pStyle w:val="BodyText"/>
+      </w:pPr>
+      <w:r>
+        <w:rPr>
+          <w:lang w:val="en"/>
+        </w:rPr>
+        <w:t xml:space="preserve">Distinguish fine-tuning (labeled prompt-response pairs for style/task) vs continued pre-training (unlabeled text for domain vocabulary). Distinguish Model Invocation Logging (payloads) vs CloudTrail (management APIs only).</w:t>
+      </w:r>
+    </w:p>
+    <w:p>
+      <w:pPr>
+        <w:pStyle w:val="BodyText"/>
+      </w:pPr>
+      <w:r>
+        <w:rPr>
+          <w:lang w:val="en"/>
+        </w:rPr>
+        <w:t xml:space="preserve">🎯 Pattern 5: Managed-First Solution Ladder</w:t>
+      </w:r>
+    </w:p>
+    <w:p>
+      <w:pPr>
+        <w:pStyle w:val="BodyText"/>
+      </w:pPr>
+      <w:r>
+        <w:rPr>
+          <w:lang w:val="en"/>
+        </w:rPr>
+        <w:t xml:space="preserve">Always choose the lowest rung on the ladder that solves the problem: Prompt Engineering -&gt; RAG -&gt; Fine-Tuning -&gt; Pre-training. Never fine-tune when RAG solves dynamic factual freshness.</w:t>
+      </w:r>
+    </w:p>
+    <w:p>
+      <w:pPr>
+        <w:pStyle w:val="BodyText"/>
+      </w:pPr>
+      <w:r>
+        <w:rPr>
+          <w:lang w:val="en"/>
+        </w:rPr>
+        <w:t xml:space="preserve">🎯 Pattern 6: Wrong-Plane Distractors</w:t>
+      </w:r>
+    </w:p>
+    <w:p>
+      <w:pPr>
+        <w:pStyle w:val="BodyText"/>
+      </w:pPr>
+      <w:r>
+        <w:rPr>
+          <w:lang w:val="en"/>
+        </w:rPr>
+        <w:t xml:space="preserve">Distractors frequently offer data-plane solutions for control-plane problems (or vice versa). Example: Trying to audit prompt text via CloudTrail, or trying to isolate network traffic using S3 Gateway endpoints instead of PrivateLink.</w:t>
+      </w:r>
+    </w:p>
+    <w:p>
+      <w:pPr>
+        <w:pStyle w:val="BodyText"/>
+      </w:pPr>
+      <w:r>
+        <w:rPr>
+          <w:lang w:val="en"/>
+        </w:rPr>
+        <w:t xml:space="preserve">Part 5: 30-Second Rapid Elimination Decision Matrix</w:t>
       </w:r>
     </w:p>
     <w:tbl>
@@ -20580,6 +21146,94 @@
                 <w:lang w:val="en"/>
               </w:rPr>
               <w:t xml:space="preserve">Synchronous on-demand costs 2x more and hits request quotas</w:t>
+            </w:r>
+          </w:p>
+        </w:tc>
+      </w:tr>
+      <w:tr>
+        <w:tc>
+          <w:tcPr/>
+          <w:p>
+            <w:pPr>
+              <w:pStyle w:val="Compact"/>
+            </w:pPr>
+            <w:r>
+              <w:rPr>
+                <w:lang w:val="en"/>
+              </w:rPr>
+              <w:t xml:space="preserve">Sensitive database updates / wire transfers</w:t>
+            </w:r>
+          </w:p>
+        </w:tc>
+        <w:tc>
+          <w:tcPr/>
+          <w:p>
+            <w:pPr>
+              <w:pStyle w:val="Compact"/>
+            </w:pPr>
+            <w:r>
+              <w:rPr>
+                <w:lang w:val="en"/>
+              </w:rPr>
+              <w:t xml:space="preserve">Action Group RETURN_OF_CONTROL / Step Functions</w:t>
+            </w:r>
+          </w:p>
+        </w:tc>
+        <w:tc>
+          <w:tcPr/>
+          <w:p>
+            <w:pPr>
+              <w:pStyle w:val="Compact"/>
+            </w:pPr>
+            <w:r>
+              <w:rPr>
+                <w:lang w:val="en"/>
+              </w:rPr>
+              <w:t xml:space="preserve">Direct Lambda execution has no human review checkpoint</w:t>
+            </w:r>
+          </w:p>
+        </w:tc>
+      </w:tr>
+      <w:tr>
+        <w:tc>
+          <w:tcPr/>
+          <w:p>
+            <w:pPr>
+              <w:pStyle w:val="Compact"/>
+            </w:pPr>
+            <w:r>
+              <w:rPr>
+                <w:lang w:val="en"/>
+              </w:rPr>
+              <w:t xml:space="preserve">Agent changes not taking effect in test</w:t>
+            </w:r>
+          </w:p>
+        </w:tc>
+        <w:tc>
+          <w:tcPr/>
+          <w:p>
+            <w:pPr>
+              <w:pStyle w:val="Compact"/>
+            </w:pPr>
+            <w:r>
+              <w:rPr>
+                <w:lang w:val="en"/>
+              </w:rPr>
+              <w:t xml:space="preserve">Call PrepareAgent / Create Agent Alias</w:t>
+            </w:r>
+          </w:p>
+        </w:tc>
+        <w:tc>
+          <w:tcPr/>
+          <w:p>
+            <w:pPr>
+              <w:pStyle w:val="Compact"/>
+            </w:pPr>
+            <w:r>
+              <w:rPr>
+                <w:lang w:val="en"/>
+              </w:rPr>
+              <w:t xml:space="preserve">Draft configuration changes do not deploy until prepared</w:t>
             </w:r>
           </w:p>
         </w:tc>

</xml_diff>

<commit_message>
feat: enrich print guide with 250-question bank master key and edge-case traps in 14 compact pages
</commit_message>
<xml_diff>
--- a/AIP-C01_Overnight_Study_Guide.docx
+++ b/AIP-C01_Overnight_Study_Guide.docx
@@ -21239,6 +21239,1069 @@
         </w:tc>
       </w:tr>
     </w:tbl>
+    <w:p>
+      <w:pPr>
+        <w:pStyle w:val="BodyText"/>
+      </w:pPr>
+      <w:r>
+        <w:rPr>
+          <w:lang w:val="en"/>
+        </w:rPr>
+        <w:t xml:space="preserve">Part 6: 250-Question Bank Master Knowledge Key &amp; Blueprint Refresher</w:t>
+      </w:r>
+    </w:p>
+    <w:p>
+      <w:pPr>
+        <w:pStyle w:val="BodyText"/>
+      </w:pPr>
+      <w:r>
+        <w:rPr>
+          <w:lang w:val="en"/>
+        </w:rPr>
+        <w:t xml:space="preserve">🔑 KB Data Connectors &amp; Crawlers</w:t>
+      </w:r>
+      <w:r>
+        <w:rPr>
+          <w:lang w:val="en"/>
+        </w:rPr>
+        <w:t xml:space="preserve">Enterprise Sources &amp; Urgent Ingestion</w:t>
+      </w:r>
+    </w:p>
+    <w:p>
+      <w:pPr>
+        <w:pStyle w:val="Compact"/>
+        <w:numPr>
+          <w:ilvl w:val="0"/>
+          <w:numId w:val="1109"/>
+        </w:numPr>
+      </w:pPr>
+      <w:r>
+        <w:rPr>
+          <w:b/>
+          <w:bCs/>
+          <w:lang w:val="en"/>
+        </w:rPr>
+        <w:t xml:space="preserve">Data Connectors:</w:t>
+      </w:r>
+      <w:r>
+        <w:rPr>
+          <w:lang w:val="en"/>
+        </w:rPr>
+        <w:t xml:space="preserve"> </w:t>
+      </w:r>
+      <w:r>
+        <w:rPr>
+          <w:lang w:val="en"/>
+        </w:rPr>
+        <w:t xml:space="preserve">Knowledge Bases natively connect to Amazon S3, Atlassian Confluence, Microsoft SharePoint, Salesforce, and Web Crawler.</w:t>
+      </w:r>
+    </w:p>
+    <w:p>
+      <w:pPr>
+        <w:pStyle w:val="Compact"/>
+        <w:numPr>
+          <w:ilvl w:val="0"/>
+          <w:numId w:val="1109"/>
+        </w:numPr>
+      </w:pPr>
+      <w:r>
+        <w:rPr>
+          <w:b/>
+          <w:bCs/>
+          <w:lang w:val="en"/>
+        </w:rPr>
+        <w:t xml:space="preserve">Web Crawler Data Source:</w:t>
+      </w:r>
+      <w:r>
+        <w:rPr>
+          <w:lang w:val="en"/>
+        </w:rPr>
+        <w:t xml:space="preserve"> </w:t>
+      </w:r>
+      <w:r>
+        <w:rPr>
+          <w:lang w:val="en"/>
+        </w:rPr>
+        <w:t xml:space="preserve">Crawls public websites/documentation portals on a scheduled cadence (e.g. weekly) without building custom crawlers. Respects robots.txt.</w:t>
+      </w:r>
+    </w:p>
+    <w:p>
+      <w:pPr>
+        <w:pStyle w:val="Compact"/>
+        <w:numPr>
+          <w:ilvl w:val="0"/>
+          <w:numId w:val="1109"/>
+        </w:numPr>
+      </w:pPr>
+      <w:r>
+        <w:rPr>
+          <w:b/>
+          <w:bCs/>
+          <w:lang w:val="en"/>
+        </w:rPr>
+        <w:t xml:space="preserve">Event-Driven Ingestion:</w:t>
+      </w:r>
+      <w:r>
+        <w:rPr>
+          <w:lang w:val="en"/>
+        </w:rPr>
+        <w:t xml:space="preserve"> </w:t>
+      </w:r>
+      <w:r>
+        <w:rPr>
+          <w:lang w:val="en"/>
+        </w:rPr>
+        <w:t xml:space="preserve">For urgent amendments needing indexing within 1 hour, configure S3 Event Notifications (s3:ObjectCreated:*) or EventBridge to trigger an AWS Lambda function calling</w:t>
+      </w:r>
+      <w:r>
+        <w:rPr>
+          <w:lang w:val="en"/>
+        </w:rPr>
+        <w:t xml:space="preserve"> </w:t>
+      </w:r>
+      <w:r>
+        <w:rPr>
+          <w:rStyle w:val="VerbatimChar"/>
+          <w:lang w:val="en"/>
+        </w:rPr>
+        <w:t xml:space="preserve">bedrock-agent.start_ingestion_job()</w:t>
+      </w:r>
+      <w:r>
+        <w:rPr>
+          <w:lang w:val="en"/>
+        </w:rPr>
+        <w:t xml:space="preserve">.</w:t>
+      </w:r>
+    </w:p>
+    <w:p>
+      <w:pPr>
+        <w:pStyle w:val="Compact"/>
+        <w:numPr>
+          <w:ilvl w:val="0"/>
+          <w:numId w:val="1109"/>
+        </w:numPr>
+      </w:pPr>
+      <w:r>
+        <w:rPr>
+          <w:b/>
+          <w:bCs/>
+          <w:lang w:val="en"/>
+        </w:rPr>
+        <w:t xml:space="preserve">Multilingual Embeddings:</w:t>
+      </w:r>
+      <w:r>
+        <w:rPr>
+          <w:lang w:val="en"/>
+        </w:rPr>
+        <w:t xml:space="preserve"> </w:t>
+      </w:r>
+      <w:r>
+        <w:rPr>
+          <w:lang w:val="en"/>
+        </w:rPr>
+        <w:t xml:space="preserve">When corpus spans multiple languages (e.g. 12+), choose</w:t>
+      </w:r>
+      <w:r>
+        <w:rPr>
+          <w:lang w:val="en"/>
+        </w:rPr>
+        <w:t xml:space="preserve"> </w:t>
+      </w:r>
+      <w:r>
+        <w:rPr>
+          <w:rStyle w:val="VerbatimChar"/>
+          <w:lang w:val="en"/>
+        </w:rPr>
+        <w:t xml:space="preserve">cohere.embed-multilingual-v3</w:t>
+      </w:r>
+      <w:r>
+        <w:rPr>
+          <w:lang w:val="en"/>
+        </w:rPr>
+        <w:t xml:space="preserve">. MANDATORY: set</w:t>
+      </w:r>
+      <w:r>
+        <w:rPr>
+          <w:lang w:val="en"/>
+        </w:rPr>
+        <w:t xml:space="preserve"> </w:t>
+      </w:r>
+      <w:r>
+        <w:rPr>
+          <w:rStyle w:val="VerbatimChar"/>
+          <w:lang w:val="en"/>
+        </w:rPr>
+        <w:t xml:space="preserve">input_type='search_query'</w:t>
+      </w:r>
+      <w:r>
+        <w:rPr>
+          <w:lang w:val="en"/>
+        </w:rPr>
+        <w:t xml:space="preserve"> </w:t>
+      </w:r>
+      <w:r>
+        <w:rPr>
+          <w:lang w:val="en"/>
+        </w:rPr>
+        <w:t xml:space="preserve">for runtime queries and</w:t>
+      </w:r>
+      <w:r>
+        <w:rPr>
+          <w:lang w:val="en"/>
+        </w:rPr>
+        <w:t xml:space="preserve"> </w:t>
+      </w:r>
+      <w:r>
+        <w:rPr>
+          <w:rStyle w:val="VerbatimChar"/>
+          <w:lang w:val="en"/>
+        </w:rPr>
+        <w:t xml:space="preserve">input_type='search_document'</w:t>
+      </w:r>
+      <w:r>
+        <w:rPr>
+          <w:lang w:val="en"/>
+        </w:rPr>
+        <w:t xml:space="preserve"> </w:t>
+      </w:r>
+      <w:r>
+        <w:rPr>
+          <w:lang w:val="en"/>
+        </w:rPr>
+        <w:t xml:space="preserve">for ingested texts.</w:t>
+      </w:r>
+    </w:p>
+    <w:p>
+      <w:pPr>
+        <w:pStyle w:val="FirstParagraph"/>
+      </w:pPr>
+      <w:r>
+        <w:rPr>
+          <w:lang w:val="en"/>
+        </w:rPr>
+        <w:t xml:space="preserve">🔑 SageMaker Inference Taxonomy</w:t>
+      </w:r>
+      <w:r>
+        <w:rPr>
+          <w:lang w:val="en"/>
+        </w:rPr>
+        <w:t xml:space="preserve">Real-Time vs Serverless vs Async vs Batch</w:t>
+      </w:r>
+    </w:p>
+    <w:p>
+      <w:pPr>
+        <w:pStyle w:val="Compact"/>
+        <w:numPr>
+          <w:ilvl w:val="0"/>
+          <w:numId w:val="1110"/>
+        </w:numPr>
+      </w:pPr>
+      <w:r>
+        <w:rPr>
+          <w:b/>
+          <w:bCs/>
+          <w:lang w:val="en"/>
+        </w:rPr>
+        <w:t xml:space="preserve">Real-time Endpoint:</w:t>
+      </w:r>
+      <w:r>
+        <w:rPr>
+          <w:lang w:val="en"/>
+        </w:rPr>
+        <w:t xml:space="preserve"> </w:t>
+      </w:r>
+      <w:r>
+        <w:rPr>
+          <w:lang w:val="en"/>
+        </w:rPr>
+        <w:t xml:space="preserve">Persistent compute, sustained 24/7 traffic, strict sub-100ms latency budgets.</w:t>
+      </w:r>
+    </w:p>
+    <w:p>
+      <w:pPr>
+        <w:pStyle w:val="Compact"/>
+        <w:numPr>
+          <w:ilvl w:val="0"/>
+          <w:numId w:val="1110"/>
+        </w:numPr>
+      </w:pPr>
+      <w:r>
+        <w:rPr>
+          <w:b/>
+          <w:bCs/>
+          <w:lang w:val="en"/>
+        </w:rPr>
+        <w:t xml:space="preserve">Serverless Inference:</w:t>
+      </w:r>
+      <w:r>
+        <w:rPr>
+          <w:lang w:val="en"/>
+        </w:rPr>
+        <w:t xml:space="preserve"> </w:t>
+      </w:r>
+      <w:r>
+        <w:rPr>
+          <w:lang w:val="en"/>
+        </w:rPr>
+        <w:t xml:space="preserve">Automatic scale-to-zero for intermittent, bursty traffic with idle periods. Pay only for compute seconds.</w:t>
+      </w:r>
+    </w:p>
+    <w:p>
+      <w:pPr>
+        <w:pStyle w:val="Compact"/>
+        <w:numPr>
+          <w:ilvl w:val="0"/>
+          <w:numId w:val="1110"/>
+        </w:numPr>
+      </w:pPr>
+      <w:r>
+        <w:rPr>
+          <w:b/>
+          <w:bCs/>
+          <w:lang w:val="en"/>
+        </w:rPr>
+        <w:t xml:space="preserve">Async Inference:</w:t>
+      </w:r>
+      <w:r>
+        <w:rPr>
+          <w:lang w:val="en"/>
+        </w:rPr>
+        <w:t xml:space="preserve"> </w:t>
+      </w:r>
+      <w:r>
+        <w:rPr>
+          <w:lang w:val="en"/>
+        </w:rPr>
+        <w:t xml:space="preserve">Built for large payloads (up to 1GB) and long execution times (30 to 60 minutes, up to 1 hour, e.g. long video summarization). Queues requests, writes results directly to S3, and sends completion alerts via Amazon SNS.</w:t>
+      </w:r>
+    </w:p>
+    <w:p>
+      <w:pPr>
+        <w:pStyle w:val="Compact"/>
+        <w:numPr>
+          <w:ilvl w:val="0"/>
+          <w:numId w:val="1110"/>
+        </w:numPr>
+      </w:pPr>
+      <w:r>
+        <w:rPr>
+          <w:b/>
+          <w:bCs/>
+          <w:lang w:val="en"/>
+        </w:rPr>
+        <w:t xml:space="preserve">Batch Transform:</w:t>
+      </w:r>
+      <w:r>
+        <w:rPr>
+          <w:lang w:val="en"/>
+        </w:rPr>
+        <w:t xml:space="preserve"> </w:t>
+      </w:r>
+      <w:r>
+        <w:rPr>
+          <w:lang w:val="en"/>
+        </w:rPr>
+        <w:t xml:space="preserve">Non-real-time bulk scoring across static datasets stored in S3. Compute cluster spins up, processes dataset, and shuts down completely.</w:t>
+      </w:r>
+    </w:p>
+    <w:p>
+      <w:pPr>
+        <w:pStyle w:val="FirstParagraph"/>
+      </w:pPr>
+      <w:r>
+        <w:rPr>
+          <w:lang w:val="en"/>
+        </w:rPr>
+        <w:t xml:space="preserve">🔑 Enterprise Orchestration &amp; Multi-Agent</w:t>
+      </w:r>
+      <w:r>
+        <w:rPr>
+          <w:lang w:val="en"/>
+        </w:rPr>
+        <w:t xml:space="preserve">Bedrock Flows vs Step Functions</w:t>
+      </w:r>
+    </w:p>
+    <w:p>
+      <w:pPr>
+        <w:pStyle w:val="Compact"/>
+        <w:numPr>
+          <w:ilvl w:val="0"/>
+          <w:numId w:val="1111"/>
+        </w:numPr>
+      </w:pPr>
+      <w:r>
+        <w:rPr>
+          <w:b/>
+          <w:bCs/>
+          <w:lang w:val="en"/>
+        </w:rPr>
+        <w:t xml:space="preserve">Bedrock Flows:</w:t>
+      </w:r>
+      <w:r>
+        <w:rPr>
+          <w:lang w:val="en"/>
+        </w:rPr>
+        <w:t xml:space="preserve"> </w:t>
+      </w:r>
+      <w:r>
+        <w:rPr>
+          <w:lang w:val="en"/>
+        </w:rPr>
+        <w:t xml:space="preserve">Visual, low-code/no-code prompt chaining and branching (e.g. Summarize -&gt; Classify -&gt; Draft Reply). Best for prompt engineering workflows without custom code.</w:t>
+      </w:r>
+    </w:p>
+    <w:p>
+      <w:pPr>
+        <w:pStyle w:val="Compact"/>
+        <w:numPr>
+          <w:ilvl w:val="0"/>
+          <w:numId w:val="1111"/>
+        </w:numPr>
+      </w:pPr>
+      <w:r>
+        <w:rPr>
+          <w:b/>
+          <w:bCs/>
+          <w:lang w:val="en"/>
+        </w:rPr>
+        <w:t xml:space="preserve">AWS Step Functions:</w:t>
+      </w:r>
+      <w:r>
+        <w:rPr>
+          <w:lang w:val="en"/>
+        </w:rPr>
+        <w:t xml:space="preserve"> </w:t>
+      </w:r>
+      <w:r>
+        <w:rPr>
+          <w:lang w:val="en"/>
+        </w:rPr>
+        <w:t xml:space="preserve">Enterprise workflow engine. MANDATORY when requiring human-in-the-loop approval waits (using</w:t>
+      </w:r>
+      <w:r>
+        <w:rPr>
+          <w:lang w:val="en"/>
+        </w:rPr>
+        <w:t xml:space="preserve"> </w:t>
+      </w:r>
+      <w:r>
+        <w:rPr>
+          <w:rStyle w:val="VerbatimChar"/>
+          <w:lang w:val="en"/>
+        </w:rPr>
+        <w:t xml:space="preserve">.waitForTaskToken</w:t>
+      </w:r>
+      <w:r>
+        <w:rPr>
+          <w:lang w:val="en"/>
+        </w:rPr>
+        <w:t xml:space="preserve"> </w:t>
+      </w:r>
+      <w:r>
+        <w:rPr>
+          <w:lang w:val="en"/>
+        </w:rPr>
+        <w:t xml:space="preserve">callback with e.g. 4-hour timeout), complex retries, and auditable decision history.</w:t>
+      </w:r>
+    </w:p>
+    <w:p>
+      <w:pPr>
+        <w:pStyle w:val="Compact"/>
+        <w:numPr>
+          <w:ilvl w:val="0"/>
+          <w:numId w:val="1111"/>
+        </w:numPr>
+      </w:pPr>
+      <w:r>
+        <w:rPr>
+          <w:b/>
+          <w:bCs/>
+          <w:lang w:val="en"/>
+        </w:rPr>
+        <w:t xml:space="preserve">Multi-Agent Supervisor Topology:</w:t>
+      </w:r>
+      <w:r>
+        <w:rPr>
+          <w:lang w:val="en"/>
+        </w:rPr>
+        <w:t xml:space="preserve"> </w:t>
+      </w:r>
+      <w:r>
+        <w:rPr>
+          <w:lang w:val="en"/>
+        </w:rPr>
+        <w:t xml:space="preserve">When serving multiple isolated departments (clinical, billing, scheduling), deploy one Supervisor Agent that uses natural language intent to route to specialized Collaborator Agents, each with its own domain-isolated Knowledge Base.</w:t>
+      </w:r>
+    </w:p>
+    <w:p>
+      <w:pPr>
+        <w:pStyle w:val="FirstParagraph"/>
+      </w:pPr>
+      <w:r>
+        <w:rPr>
+          <w:lang w:val="en"/>
+        </w:rPr>
+        <w:t xml:space="preserve">🔑 Governance, Lake Formation &amp; Responsible AI</w:t>
+      </w:r>
+      <w:r>
+        <w:rPr>
+          <w:lang w:val="en"/>
+        </w:rPr>
+        <w:t xml:space="preserve">Fine-Grained Access &amp; Continuous Monitoring</w:t>
+      </w:r>
+    </w:p>
+    <w:p>
+      <w:pPr>
+        <w:pStyle w:val="Compact"/>
+        <w:numPr>
+          <w:ilvl w:val="0"/>
+          <w:numId w:val="1112"/>
+        </w:numPr>
+      </w:pPr>
+      <w:r>
+        <w:rPr>
+          <w:b/>
+          <w:bCs/>
+          <w:lang w:val="en"/>
+        </w:rPr>
+        <w:t xml:space="preserve">AWS Lake Formation:</w:t>
+      </w:r>
+      <w:r>
+        <w:rPr>
+          <w:lang w:val="en"/>
+        </w:rPr>
+        <w:t xml:space="preserve"> </w:t>
+      </w:r>
+      <w:r>
+        <w:rPr>
+          <w:lang w:val="en"/>
+        </w:rPr>
+        <w:t xml:space="preserve">Enforces granular column-level and row-level access control on data lake tables (e.g. Team B sees salary column, Team A does not). Standard IAM policies only grant coarse table/bucket access.</w:t>
+      </w:r>
+    </w:p>
+    <w:p>
+      <w:pPr>
+        <w:pStyle w:val="Compact"/>
+        <w:numPr>
+          <w:ilvl w:val="0"/>
+          <w:numId w:val="1112"/>
+        </w:numPr>
+      </w:pPr>
+      <w:r>
+        <w:rPr>
+          <w:b/>
+          <w:bCs/>
+          <w:lang w:val="en"/>
+        </w:rPr>
+        <w:t xml:space="preserve">Continuous Bias Drift Monitoring:</w:t>
+      </w:r>
+      <w:r>
+        <w:rPr>
+          <w:lang w:val="en"/>
+        </w:rPr>
+        <w:t xml:space="preserve"> </w:t>
+      </w:r>
+      <w:r>
+        <w:rPr>
+          <w:lang w:val="en"/>
+        </w:rPr>
+        <w:t xml:space="preserve">Passing launch-time tests is insufficient. Enterprise compliance requires continuous bias and fairness drift monitoring with automated CloudWatch alerts.</w:t>
+      </w:r>
+    </w:p>
+    <w:p>
+      <w:pPr>
+        <w:pStyle w:val="Compact"/>
+        <w:numPr>
+          <w:ilvl w:val="0"/>
+          <w:numId w:val="1112"/>
+        </w:numPr>
+      </w:pPr>
+      <w:r>
+        <w:rPr>
+          <w:b/>
+          <w:bCs/>
+          <w:lang w:val="en"/>
+        </w:rPr>
+        <w:t xml:space="preserve">Model Cards:</w:t>
+      </w:r>
+      <w:r>
+        <w:rPr>
+          <w:lang w:val="en"/>
+        </w:rPr>
+        <w:t xml:space="preserve"> </w:t>
+      </w:r>
+      <w:r>
+        <w:rPr>
+          <w:lang w:val="en"/>
+        </w:rPr>
+        <w:t xml:space="preserve">Standardized documentation recording intended use cases, training data provenance, operational limitations, ethical considerations, and evaluation metrics for regulatory scrutiny.</w:t>
+      </w:r>
+    </w:p>
+    <w:p>
+      <w:pPr>
+        <w:pStyle w:val="Compact"/>
+        <w:numPr>
+          <w:ilvl w:val="0"/>
+          <w:numId w:val="1112"/>
+        </w:numPr>
+      </w:pPr>
+      <w:r>
+        <w:rPr>
+          <w:b/>
+          <w:bCs/>
+          <w:lang w:val="en"/>
+        </w:rPr>
+        <w:t xml:space="preserve">The Obfuscation Trap:</w:t>
+      </w:r>
+      <w:r>
+        <w:rPr>
+          <w:lang w:val="en"/>
+        </w:rPr>
+        <w:t xml:space="preserve"> </w:t>
+      </w:r>
+      <w:r>
+        <w:rPr>
+          <w:lang w:val="en"/>
+        </w:rPr>
+        <w:t xml:space="preserve">Running text through Amazon Translate to another language does NOT redact PII; semantic meaning and PII remain intact! Always use Bedrock Guardrails PII anonymization/blocking.</w:t>
+      </w:r>
+    </w:p>
+    <w:p>
+      <w:pPr>
+        <w:pStyle w:val="Compact"/>
+        <w:numPr>
+          <w:ilvl w:val="0"/>
+          <w:numId w:val="1112"/>
+        </w:numPr>
+      </w:pPr>
+      <w:r>
+        <w:rPr>
+          <w:b/>
+          <w:bCs/>
+          <w:lang w:val="en"/>
+        </w:rPr>
+        <w:t xml:space="preserve">Responsible AI Core Pillars:</w:t>
+      </w:r>
+      <w:r>
+        <w:rPr>
+          <w:lang w:val="en"/>
+        </w:rPr>
+        <w:t xml:space="preserve"> </w:t>
+      </w:r>
+      <w:r>
+        <w:rPr>
+          <w:lang w:val="en"/>
+        </w:rPr>
+        <w:t xml:space="preserve">Fairness, Veracity (factuality), Transparency, Explainability, Robustness, Privacy &amp; Security, Safety.</w:t>
+      </w:r>
+    </w:p>
+    <w:p>
+      <w:pPr>
+        <w:pStyle w:val="FirstParagraph"/>
+      </w:pPr>
+      <w:r>
+        <w:rPr>
+          <w:lang w:val="en"/>
+        </w:rPr>
+        <w:t xml:space="preserve">🔑 Tool Hosting &amp; MCP Architecture</w:t>
+      </w:r>
+      <w:r>
+        <w:rPr>
+          <w:lang w:val="en"/>
+        </w:rPr>
+        <w:t xml:space="preserve">Lambda vs ECS Container Hosting</w:t>
+      </w:r>
+    </w:p>
+    <w:p>
+      <w:pPr>
+        <w:pStyle w:val="Compact"/>
+        <w:numPr>
+          <w:ilvl w:val="0"/>
+          <w:numId w:val="1113"/>
+        </w:numPr>
+      </w:pPr>
+      <w:r>
+        <w:rPr>
+          <w:b/>
+          <w:bCs/>
+          <w:lang w:val="en"/>
+        </w:rPr>
+        <w:t xml:space="preserve">Lightweight Utility Tools:</w:t>
+      </w:r>
+      <w:r>
+        <w:rPr>
+          <w:lang w:val="en"/>
+        </w:rPr>
+        <w:t xml:space="preserve"> </w:t>
+      </w:r>
+      <w:r>
+        <w:rPr>
+          <w:lang w:val="en"/>
+        </w:rPr>
+        <w:t xml:space="preserve">Host on AWS Lambda (serverless, sub-second spin-up, 15-minute runtime ceiling).</w:t>
+      </w:r>
+    </w:p>
+    <w:p>
+      <w:pPr>
+        <w:pStyle w:val="Compact"/>
+        <w:numPr>
+          <w:ilvl w:val="0"/>
+          <w:numId w:val="1113"/>
+        </w:numPr>
+      </w:pPr>
+      <w:r>
+        <w:rPr>
+          <w:b/>
+          <w:bCs/>
+          <w:lang w:val="en"/>
+        </w:rPr>
+        <w:t xml:space="preserve">Heavy / Stateful Compute Tools:</w:t>
+      </w:r>
+      <w:r>
+        <w:rPr>
+          <w:lang w:val="en"/>
+        </w:rPr>
+        <w:t xml:space="preserve"> </w:t>
+      </w:r>
+      <w:r>
+        <w:rPr>
+          <w:lang w:val="en"/>
+        </w:rPr>
+        <w:t xml:space="preserve">Host on Amazon ECS / AWS Fargate containerized MCP servers (e.g. complex pricing engines, long-running simulations, or code execution sandboxes).</w:t>
+      </w:r>
+    </w:p>
+    <w:p>
+      <w:pPr>
+        <w:pStyle w:val="FirstParagraph"/>
+      </w:pPr>
+      <w:r>
+        <w:rPr>
+          <w:lang w:val="en"/>
+        </w:rPr>
+        <w:t xml:space="preserve">🔑 Prerequisite Foundations Refresher Key</w:t>
+      </w:r>
+      <w:r>
+        <w:rPr>
+          <w:lang w:val="en"/>
+        </w:rPr>
+        <w:t xml:space="preserve">Cloud Architecture &amp; ML Core</w:t>
+      </w:r>
+    </w:p>
+    <w:p>
+      <w:pPr>
+        <w:pStyle w:val="Compact"/>
+        <w:numPr>
+          <w:ilvl w:val="0"/>
+          <w:numId w:val="1114"/>
+        </w:numPr>
+      </w:pPr>
+      <w:r>
+        <w:rPr>
+          <w:b/>
+          <w:bCs/>
+          <w:lang w:val="en"/>
+        </w:rPr>
+        <w:t xml:space="preserve">S3 Lifecycle:</w:t>
+      </w:r>
+      <w:r>
+        <w:rPr>
+          <w:lang w:val="en"/>
+        </w:rPr>
+        <w:t xml:space="preserve"> </w:t>
+      </w:r>
+      <w:r>
+        <w:rPr>
+          <w:lang w:val="en"/>
+        </w:rPr>
+        <w:t xml:space="preserve">Transition objects older than 30 days to S3 Glacier Flexible Retrieval; expire after 7 years for compliance.</w:t>
+      </w:r>
+    </w:p>
+    <w:p>
+      <w:pPr>
+        <w:pStyle w:val="Compact"/>
+        <w:numPr>
+          <w:ilvl w:val="0"/>
+          <w:numId w:val="1114"/>
+        </w:numPr>
+      </w:pPr>
+      <w:r>
+        <w:rPr>
+          <w:b/>
+          <w:bCs/>
+          <w:lang w:val="en"/>
+        </w:rPr>
+        <w:t xml:space="preserve">S3 Presigned URLs:</w:t>
+      </w:r>
+      <w:r>
+        <w:rPr>
+          <w:lang w:val="en"/>
+        </w:rPr>
+        <w:t xml:space="preserve"> </w:t>
+      </w:r>
+      <w:r>
+        <w:rPr>
+          <w:lang w:val="en"/>
+        </w:rPr>
+        <w:t xml:space="preserve">Generate temporary download links (e.g. 24-hour expiry) for private objects without modifying IAM.</w:t>
+      </w:r>
+    </w:p>
+    <w:p>
+      <w:pPr>
+        <w:pStyle w:val="Compact"/>
+        <w:numPr>
+          <w:ilvl w:val="0"/>
+          <w:numId w:val="1114"/>
+        </w:numPr>
+      </w:pPr>
+      <w:r>
+        <w:rPr>
+          <w:b/>
+          <w:bCs/>
+          <w:lang w:val="en"/>
+        </w:rPr>
+        <w:t xml:space="preserve">VPC Network ACL (NACL):</w:t>
+      </w:r>
+      <w:r>
+        <w:rPr>
+          <w:lang w:val="en"/>
+        </w:rPr>
+        <w:t xml:space="preserve"> </w:t>
+      </w:r>
+      <w:r>
+        <w:rPr>
+          <w:lang w:val="en"/>
+        </w:rPr>
+        <w:t xml:space="preserve">Subnet-level stateless firewall. Deny abusive IPs immediately with a low rule number (evaluated before Security Groups).</w:t>
+      </w:r>
+    </w:p>
+    <w:p>
+      <w:pPr>
+        <w:pStyle w:val="Compact"/>
+        <w:numPr>
+          <w:ilvl w:val="0"/>
+          <w:numId w:val="1114"/>
+        </w:numPr>
+      </w:pPr>
+      <w:r>
+        <w:rPr>
+          <w:b/>
+          <w:bCs/>
+          <w:lang w:val="en"/>
+        </w:rPr>
+        <w:t xml:space="preserve">SSE-KMS Customer Managed Key (CMK):</w:t>
+      </w:r>
+      <w:r>
+        <w:rPr>
+          <w:lang w:val="en"/>
+        </w:rPr>
+        <w:t xml:space="preserve"> </w:t>
+      </w:r>
+      <w:r>
+        <w:rPr>
+          <w:lang w:val="en"/>
+        </w:rPr>
+        <w:t xml:space="preserve">Guarantees CloudTrail decryption audit logging and instant administrative key revocation.</w:t>
+      </w:r>
+    </w:p>
+    <w:p>
+      <w:pPr>
+        <w:pStyle w:val="Compact"/>
+        <w:numPr>
+          <w:ilvl w:val="0"/>
+          <w:numId w:val="1114"/>
+        </w:numPr>
+      </w:pPr>
+      <w:r>
+        <w:rPr>
+          <w:b/>
+          <w:bCs/>
+          <w:lang w:val="en"/>
+        </w:rPr>
+        <w:t xml:space="preserve">AWS Organizations:</w:t>
+      </w:r>
+      <w:r>
+        <w:rPr>
+          <w:lang w:val="en"/>
+        </w:rPr>
+        <w:t xml:space="preserve"> </w:t>
+      </w:r>
+      <w:r>
+        <w:rPr>
+          <w:lang w:val="en"/>
+        </w:rPr>
+        <w:t xml:space="preserve">Consolidated billing, volume discount tiering, and Cost Allocation Tags per team for chargebacks.</w:t>
+      </w:r>
+    </w:p>
+    <w:p>
+      <w:pPr>
+        <w:pStyle w:val="Compact"/>
+        <w:numPr>
+          <w:ilvl w:val="0"/>
+          <w:numId w:val="1114"/>
+        </w:numPr>
+      </w:pPr>
+      <w:r>
+        <w:rPr>
+          <w:b/>
+          <w:bCs/>
+          <w:lang w:val="en"/>
+        </w:rPr>
+        <w:t xml:space="preserve">SQS Dead-Letter Queue (DLQ):</w:t>
+      </w:r>
+      <w:r>
+        <w:rPr>
+          <w:lang w:val="en"/>
+        </w:rPr>
+        <w:t xml:space="preserve"> </w:t>
+      </w:r>
+      <w:r>
+        <w:rPr>
+          <w:lang w:val="en"/>
+        </w:rPr>
+        <w:t xml:space="preserve">Isolate poison-pill messages after exceeding</w:t>
+      </w:r>
+      <w:r>
+        <w:rPr>
+          <w:lang w:val="en"/>
+        </w:rPr>
+        <w:t xml:space="preserve"> </w:t>
+      </w:r>
+      <w:r>
+        <w:rPr>
+          <w:rStyle w:val="VerbatimChar"/>
+          <w:lang w:val="en"/>
+        </w:rPr>
+        <w:t xml:space="preserve">maxReceiveCount</w:t>
+      </w:r>
+      <w:r>
+        <w:rPr>
+          <w:lang w:val="en"/>
+        </w:rPr>
+        <w:t xml:space="preserve"> </w:t>
+      </w:r>
+      <w:r>
+        <w:rPr>
+          <w:lang w:val="en"/>
+        </w:rPr>
+        <w:t xml:space="preserve">to unblock queue consumers.</w:t>
+      </w:r>
+    </w:p>
+    <w:p>
+      <w:pPr>
+        <w:pStyle w:val="Compact"/>
+        <w:numPr>
+          <w:ilvl w:val="0"/>
+          <w:numId w:val="1114"/>
+        </w:numPr>
+      </w:pPr>
+      <w:r>
+        <w:rPr>
+          <w:b/>
+          <w:bCs/>
+          <w:lang w:val="en"/>
+        </w:rPr>
+        <w:t xml:space="preserve">Streaming Ingestion:</w:t>
+      </w:r>
+      <w:r>
+        <w:rPr>
+          <w:lang w:val="en"/>
+        </w:rPr>
+        <w:t xml:space="preserve"> </w:t>
+      </w:r>
+      <w:r>
+        <w:rPr>
+          <w:lang w:val="en"/>
+        </w:rPr>
+        <w:t xml:space="preserve">Amazon Kinesis Data Streams + Kinesis Data Firehose -&gt; S3 -&gt; AWS Glue DataBrew for visual, no-code data preparation.</w:t>
+      </w:r>
+    </w:p>
+    <w:p>
+      <w:pPr>
+        <w:pStyle w:val="Compact"/>
+        <w:numPr>
+          <w:ilvl w:val="0"/>
+          <w:numId w:val="1114"/>
+        </w:numPr>
+      </w:pPr>
+      <w:r>
+        <w:rPr>
+          <w:b/>
+          <w:bCs/>
+          <w:lang w:val="en"/>
+        </w:rPr>
+        <w:t xml:space="preserve">High-Cardinality Features:</w:t>
+      </w:r>
+      <w:r>
+        <w:rPr>
+          <w:lang w:val="en"/>
+        </w:rPr>
+        <w:t xml:space="preserve"> </w:t>
+      </w:r>
+      <w:r>
+        <w:rPr>
+          <w:lang w:val="en"/>
+        </w:rPr>
+        <w:t xml:space="preserve">When a column has 8,000 distinct categories (e.g. cities), use entity embeddings or the feature hashing trick (NOT one-hot encoding which creates 8,000 sparse columns).</w:t>
+      </w:r>
+    </w:p>
+    <w:p>
+      <w:pPr>
+        <w:pStyle w:val="Compact"/>
+        <w:numPr>
+          <w:ilvl w:val="0"/>
+          <w:numId w:val="1114"/>
+        </w:numPr>
+      </w:pPr>
+      <w:r>
+        <w:rPr>
+          <w:b/>
+          <w:bCs/>
+          <w:lang w:val="en"/>
+        </w:rPr>
+        <w:t xml:space="preserve">Tabular Churn Prediction:</w:t>
+      </w:r>
+      <w:r>
+        <w:rPr>
+          <w:lang w:val="en"/>
+        </w:rPr>
+        <w:t xml:space="preserve"> </w:t>
+      </w:r>
+      <w:r>
+        <w:rPr>
+          <w:lang w:val="en"/>
+        </w:rPr>
+        <w:t xml:space="preserve">Use XGBoost (Gradient Boosted Decision Trees), the state-of-the-art algorithm for structured tabular datasets.</w:t>
+      </w:r>
+    </w:p>
+    <w:p>
+      <w:pPr>
+        <w:pStyle w:val="Compact"/>
+        <w:numPr>
+          <w:ilvl w:val="0"/>
+          <w:numId w:val="1114"/>
+        </w:numPr>
+      </w:pPr>
+      <w:r>
+        <w:rPr>
+          <w:b/>
+          <w:bCs/>
+          <w:lang w:val="en"/>
+        </w:rPr>
+        <w:t xml:space="preserve">Image Synthesis:</w:t>
+      </w:r>
+      <w:r>
+        <w:rPr>
+          <w:lang w:val="en"/>
+        </w:rPr>
+        <w:t xml:space="preserve"> </w:t>
+      </w:r>
+      <w:r>
+        <w:rPr>
+          <w:lang w:val="en"/>
+        </w:rPr>
+        <w:t xml:space="preserve">Diffusion models (e.g. Amazon Titan Image Generator) are designed for generating images from natural language text.</w:t>
+      </w:r>
+    </w:p>
     <w:bookmarkEnd w:id="104"/>
     <w:sectPr>
       <w:footnotePr>
@@ -22215,6 +23278,24 @@
     <w:lvlOverride w:ilvl="8">
       <w:startOverride w:val="1"/>
     </w:lvlOverride>
+  </w:num>
+  <w:num w:numId="1109">
+    <w:abstractNumId w:val="991"/>
+  </w:num>
+  <w:num w:numId="1110">
+    <w:abstractNumId w:val="991"/>
+  </w:num>
+  <w:num w:numId="1111">
+    <w:abstractNumId w:val="991"/>
+  </w:num>
+  <w:num w:numId="1112">
+    <w:abstractNumId w:val="991"/>
+  </w:num>
+  <w:num w:numId="1113">
+    <w:abstractNumId w:val="991"/>
+  </w:num>
+  <w:num w:numId="1114">
+    <w:abstractNumId w:val="991"/>
   </w:num>
 </w:numbering>
 </file>

</xml_diff>